<commit_message>
Revised code adding analyses on species extinctions and fixing small issues
</commit_message>
<xml_diff>
--- a/output/Part1_model_table.docx
+++ b/output/Part1_model_table.docx
@@ -6,7 +6,6 @@
       <w:tblPr>
         <w:tblStyle w:val="Table"/>
         <w:tblW w:type="pct" w:w="3889"/>
-        <w:tblLayout w:type="fixed"/>
         <w:tblLook w:firstRow="1" w:lastRow="0" w:firstColumn="0" w:lastColumn="0" w:noHBand="0" w:noVBand="0" w:val="0020"/>
       </w:tblPr>
       <w:tblGrid>
@@ -15,7 +14,7 @@
       </w:tblGrid>
       <w:tr>
         <w:trPr>
-          <w:tblHeader w:val="on"/>
+          <w:tblHeader w:val="true"/>
         </w:trPr>
         <w:tc>
           <w:tcPr/>
@@ -270,14 +269,14 @@
 <file path=word/numbering.xml><?xml version="1.0" encoding="utf-8"?>
 <w:numbering xmlns:w="http://schemas.openxmlformats.org/wordprocessingml/2006/main">
   <w:abstractNum w:abstractNumId="990">
-    <w:nsid w:val="0000A990"/>
+    <w:nsid w:val="A990"/>
     <w:multiLevelType w:val="multilevel"/>
     <w:lvl w:ilvl="0">
       <w:numFmt w:val="bullet"/>
       <w:lvlText w:val=" "/>
       <w:lvlJc w:val="left"/>
       <w:pPr>
-        <w:ind w:left="720" w:hanging="360"/>
+        <w:ind w:left="720" w:hanging="480"/>
       </w:pPr>
     </w:lvl>
     <w:lvl w:ilvl="1">
@@ -285,7 +284,7 @@
       <w:lvlText w:val=" "/>
       <w:lvlJc w:val="left"/>
       <w:pPr>
-        <w:ind w:left="1440" w:hanging="360"/>
+        <w:ind w:left="1440" w:hanging="480"/>
       </w:pPr>
     </w:lvl>
     <w:lvl w:ilvl="2">
@@ -293,7 +292,7 @@
       <w:lvlText w:val=" "/>
       <w:lvlJc w:val="left"/>
       <w:pPr>
-        <w:ind w:left="2160" w:hanging="360"/>
+        <w:ind w:left="2160" w:hanging="480"/>
       </w:pPr>
     </w:lvl>
     <w:lvl w:ilvl="3">
@@ -301,7 +300,7 @@
       <w:lvlText w:val=" "/>
       <w:lvlJc w:val="left"/>
       <w:pPr>
-        <w:ind w:left="2880" w:hanging="360"/>
+        <w:ind w:left="2880" w:hanging="480"/>
       </w:pPr>
     </w:lvl>
     <w:lvl w:ilvl="4">
@@ -309,7 +308,7 @@
       <w:lvlText w:val=" "/>
       <w:lvlJc w:val="left"/>
       <w:pPr>
-        <w:ind w:left="3600" w:hanging="360"/>
+        <w:ind w:left="3600" w:hanging="480"/>
       </w:pPr>
     </w:lvl>
     <w:lvl w:ilvl="5">
@@ -317,7 +316,7 @@
       <w:lvlText w:val=" "/>
       <w:lvlJc w:val="left"/>
       <w:pPr>
-        <w:ind w:left="4320" w:hanging="360"/>
+        <w:ind w:left="4320" w:hanging="480"/>
       </w:pPr>
     </w:lvl>
     <w:lvl w:ilvl="6">
@@ -325,7 +324,7 @@
       <w:lvlText w:val=" "/>
       <w:lvlJc w:val="left"/>
       <w:pPr>
-        <w:ind w:left="5040" w:hanging="360"/>
+        <w:ind w:left="5040" w:hanging="480"/>
       </w:pPr>
     </w:lvl>
     <w:lvl w:ilvl="7">
@@ -333,7 +332,7 @@
       <w:lvlText w:val=" "/>
       <w:lvlJc w:val="left"/>
       <w:pPr>
-        <w:ind w:left="5760" w:hanging="360"/>
+        <w:ind w:left="5760" w:hanging="480"/>
       </w:pPr>
     </w:lvl>
     <w:lvl w:ilvl="8">
@@ -341,12 +340,12 @@
       <w:lvlText w:val=" "/>
       <w:lvlJc w:val="left"/>
       <w:pPr>
-        <w:ind w:left="6480" w:hanging="360"/>
+        <w:ind w:left="6480" w:hanging="480"/>
       </w:pPr>
     </w:lvl>
   </w:abstractNum>
   <w:abstractNum w:abstractNumId="99431">
-    <w:nsid w:val="00A99431"/>
+    <w:nsid w:val="A99431"/>
     <w:multiLevelType w:val="multilevel"/>
     <w:lvl w:ilvl="0">
       <w:start w:val="1"/>
@@ -354,7 +353,7 @@
       <w:lvlText w:val="(%1)"/>
       <w:lvlJc w:val="left"/>
       <w:pPr>
-        <w:ind w:left="720" w:hanging="360"/>
+        <w:ind w:left="720" w:hanging="480"/>
       </w:pPr>
     </w:lvl>
     <w:lvl w:ilvl="1">
@@ -363,7 +362,7 @@
       <w:lvlText w:val="(%2)"/>
       <w:lvlJc w:val="left"/>
       <w:pPr>
-        <w:ind w:left="1440" w:hanging="360"/>
+        <w:ind w:left="1440" w:hanging="480"/>
       </w:pPr>
     </w:lvl>
     <w:lvl w:ilvl="2">
@@ -372,7 +371,7 @@
       <w:lvlText w:val="(%3)"/>
       <w:lvlJc w:val="left"/>
       <w:pPr>
-        <w:ind w:left="2160" w:hanging="360"/>
+        <w:ind w:left="2160" w:hanging="480"/>
       </w:pPr>
     </w:lvl>
     <w:lvl w:ilvl="3">
@@ -381,7 +380,7 @@
       <w:lvlText w:val="(%4)"/>
       <w:lvlJc w:val="left"/>
       <w:pPr>
-        <w:ind w:left="2880" w:hanging="360"/>
+        <w:ind w:left="2880" w:hanging="480"/>
       </w:pPr>
     </w:lvl>
     <w:lvl w:ilvl="4">
@@ -390,7 +389,7 @@
       <w:lvlText w:val="(%5)"/>
       <w:lvlJc w:val="left"/>
       <w:pPr>
-        <w:ind w:left="3600" w:hanging="360"/>
+        <w:ind w:left="3600" w:hanging="480"/>
       </w:pPr>
     </w:lvl>
     <w:lvl w:ilvl="5">
@@ -399,7 +398,7 @@
       <w:lvlText w:val="(%6)"/>
       <w:lvlJc w:val="left"/>
       <w:pPr>
-        <w:ind w:left="4320" w:hanging="360"/>
+        <w:ind w:left="4320" w:hanging="480"/>
       </w:pPr>
     </w:lvl>
     <w:lvl w:ilvl="6">
@@ -408,7 +407,7 @@
       <w:lvlText w:val="(%7)"/>
       <w:lvlJc w:val="left"/>
       <w:pPr>
-        <w:ind w:left="5040" w:hanging="360"/>
+        <w:ind w:left="5040" w:hanging="480"/>
       </w:pPr>
     </w:lvl>
     <w:lvl w:ilvl="7">
@@ -417,7 +416,7 @@
       <w:lvlText w:val="(%8)"/>
       <w:lvlJc w:val="left"/>
       <w:pPr>
-        <w:ind w:left="5760" w:hanging="360"/>
+        <w:ind w:left="5760" w:hanging="480"/>
       </w:pPr>
     </w:lvl>
     <w:lvl w:ilvl="8">
@@ -426,7 +425,7 @@
       <w:lvlText w:val="(%9)"/>
       <w:lvlJc w:val="left"/>
       <w:pPr>
-        <w:ind w:left="6480" w:hanging="360"/>
+        <w:ind w:left="6480" w:hanging="480"/>
       </w:pPr>
     </w:lvl>
   </w:abstractNum>
@@ -492,10 +491,10 @@
     <w:name w:val="Body Text"/>
     <w:basedOn w:val="Normal"/>
     <w:link w:val="BodyTextChar"/>
-    <w:qFormat/>
     <w:pPr>
       <w:spacing w:after="180" w:before="180"/>
     </w:pPr>
+    <w:qFormat/>
   </w:style>
   <w:style w:customStyle="1" w:styleId="FirstParagraph" w:type="paragraph">
     <w:name w:val="First Paragraph"/>
@@ -515,449 +514,267 @@
     <w:name w:val="Title"/>
     <w:basedOn w:val="Normal"/>
     <w:next w:val="BodyText"/>
-    <w:link w:val="TitleChar"/>
-    <w:uiPriority w:val="10"/>
-    <w:qFormat/>
-    <w:rsid w:val="00A10FD9"/>
-    <w:pPr>
-      <w:spacing w:after="80" w:line="240" w:lineRule="auto"/>
-      <w:contextualSpacing/>
+    <w:qFormat/>
+    <w:pPr>
+      <w:keepNext/>
+      <w:keepLines/>
+      <w:spacing w:after="240" w:before="480"/>
       <w:jc w:val="center"/>
     </w:pPr>
     <w:rPr>
       <w:rFonts w:asciiTheme="majorHAnsi" w:cstheme="majorBidi" w:eastAsiaTheme="majorEastAsia" w:hAnsiTheme="majorHAnsi"/>
-      <w:spacing w:val="-10"/>
-      <w:kern w:val="28"/>
-      <w:sz w:val="56"/>
-      <w:szCs w:val="56"/>
-    </w:rPr>
-  </w:style>
-  <w:style w:customStyle="1" w:styleId="TitleChar" w:type="character">
-    <w:name w:val="Title Char"/>
-    <w:basedOn w:val="DefaultParagraphFont"/>
-    <w:link w:val="Title"/>
-    <w:uiPriority w:val="10"/>
-    <w:rsid w:val="00A10FD9"/>
-    <w:rPr>
-      <w:rFonts w:asciiTheme="majorHAnsi" w:cstheme="majorBidi" w:eastAsiaTheme="majorEastAsia" w:hAnsiTheme="majorHAnsi"/>
-      <w:spacing w:val="-10"/>
-      <w:kern w:val="28"/>
-      <w:sz w:val="56"/>
-      <w:szCs w:val="56"/>
+      <w:b/>
+      <w:bCs/>
+      <w:color w:themeColor="accent1" w:themeShade="B5" w:val="345A8A"/>
+      <w:sz w:val="36"/>
+      <w:szCs w:val="36"/>
     </w:rPr>
   </w:style>
   <w:style w:styleId="Subtitle" w:type="paragraph">
     <w:name w:val="Subtitle"/>
-    <w:basedOn w:val="Normal"/>
-    <w:next w:val="BodyText"/>
-    <w:link w:val="SubtitleChar"/>
-    <w:uiPriority w:val="11"/>
-    <w:qFormat/>
-    <w:rsid w:val="00A10FD9"/>
-    <w:pPr>
-      <w:numPr>
-        <w:ilvl w:val="1"/>
-      </w:numPr>
-    </w:pPr>
-    <w:rPr>
-      <w:rFonts w:cstheme="majorBidi" w:eastAsiaTheme="majorEastAsia"/>
-      <w:color w:themeColor="text1" w:themeTint="A6" w:val="595959"/>
-      <w:spacing w:val="15"/>
+    <w:basedOn w:val="Title"/>
+    <w:next w:val="BodyText"/>
+    <w:qFormat/>
+    <w:pPr>
+      <w:keepNext/>
+      <w:keepLines/>
+      <w:spacing w:after="240" w:before="240"/>
+      <w:jc w:val="center"/>
+    </w:pPr>
+    <w:rPr>
+      <w:sz w:val="30"/>
+      <w:szCs w:val="30"/>
+    </w:rPr>
+  </w:style>
+  <w:style w:customStyle="1" w:styleId="Author" w:type="paragraph">
+    <w:name w:val="Author"/>
+    <w:next w:val="BodyText"/>
+    <w:qFormat/>
+    <w:pPr>
+      <w:keepNext/>
+      <w:keepLines/>
+      <w:jc w:val="center"/>
+    </w:pPr>
+  </w:style>
+  <w:style w:styleId="Date" w:type="paragraph">
+    <w:name w:val="Date"/>
+    <w:next w:val="BodyText"/>
+    <w:qFormat/>
+    <w:pPr>
+      <w:keepNext/>
+      <w:keepLines/>
+      <w:jc w:val="center"/>
+    </w:pPr>
+  </w:style>
+  <w:style w:customStyle="1" w:styleId="Abstract" w:type="paragraph">
+    <w:name w:val="Abstract"/>
+    <w:basedOn w:val="Normal"/>
+    <w:next w:val="BodyText"/>
+    <w:qFormat/>
+    <w:pPr>
+      <w:keepNext/>
+      <w:keepLines/>
+      <w:spacing w:after="300" w:before="300"/>
+    </w:pPr>
+    <w:rPr>
+      <w:sz w:val="20"/>
+      <w:szCs w:val="20"/>
+    </w:rPr>
+  </w:style>
+  <w:style w:styleId="Bibliography" w:type="paragraph">
+    <w:name w:val="Bibliography"/>
+    <w:basedOn w:val="Normal"/>
+    <w:next w:val="Bibliography"/>
+    <w:qFormat/>
+    <w:pPr/>
+    <w:rPr/>
+  </w:style>
+  <w:style w:styleId="Heading1" w:type="paragraph">
+    <w:name w:val="Heading 1"/>
+    <w:basedOn w:val="Normal"/>
+    <w:next w:val="BodyText"/>
+    <w:uiPriority w:val="9"/>
+    <w:qFormat/>
+    <w:pPr>
+      <w:keepNext/>
+      <w:keepLines/>
+      <w:spacing w:after="0" w:before="480"/>
+      <w:outlineLvl w:val="0"/>
+    </w:pPr>
+    <w:rPr>
+      <w:rFonts w:asciiTheme="majorHAnsi" w:cstheme="majorBidi" w:eastAsiaTheme="majorEastAsia" w:hAnsiTheme="majorHAnsi"/>
+      <w:b/>
+      <w:bCs/>
+      <w:color w:themeColor="accent1" w:val="4F81BD"/>
+      <w:sz w:val="32"/>
+      <w:szCs w:val="32"/>
+    </w:rPr>
+  </w:style>
+  <w:style w:styleId="Heading2" w:type="paragraph">
+    <w:name w:val="Heading 2"/>
+    <w:basedOn w:val="Normal"/>
+    <w:next w:val="BodyText"/>
+    <w:uiPriority w:val="9"/>
+    <w:unhideWhenUsed/>
+    <w:qFormat/>
+    <w:pPr>
+      <w:keepNext/>
+      <w:keepLines/>
+      <w:spacing w:after="0" w:before="200"/>
+      <w:outlineLvl w:val="1"/>
+    </w:pPr>
+    <w:rPr>
+      <w:rFonts w:asciiTheme="majorHAnsi" w:cstheme="majorBidi" w:eastAsiaTheme="majorEastAsia" w:hAnsiTheme="majorHAnsi"/>
+      <w:b/>
+      <w:bCs/>
+      <w:color w:themeColor="accent1" w:val="4F81BD"/>
       <w:sz w:val="28"/>
       <w:szCs w:val="28"/>
     </w:rPr>
   </w:style>
-  <w:style w:customStyle="1" w:styleId="SubtitleChar" w:type="character">
-    <w:name w:val="Subtitle Char"/>
-    <w:basedOn w:val="DefaultParagraphFont"/>
-    <w:link w:val="Subtitle"/>
-    <w:uiPriority w:val="11"/>
-    <w:rsid w:val="00A10FD9"/>
-    <w:rPr>
-      <w:rFonts w:cstheme="majorBidi" w:eastAsiaTheme="majorEastAsia"/>
-      <w:color w:themeColor="text1" w:themeTint="A6" w:val="595959"/>
-      <w:spacing w:val="15"/>
-      <w:sz w:val="28"/>
-      <w:szCs w:val="28"/>
-    </w:rPr>
-  </w:style>
-  <w:style w:customStyle="1" w:styleId="Author" w:type="paragraph">
-    <w:name w:val="Author"/>
-    <w:next w:val="BodyText"/>
+  <w:style w:styleId="Heading3" w:type="paragraph">
+    <w:name w:val="Heading 3"/>
+    <w:basedOn w:val="Normal"/>
+    <w:next w:val="BodyText"/>
+    <w:uiPriority w:val="9"/>
+    <w:unhideWhenUsed/>
     <w:qFormat/>
     <w:pPr>
       <w:keepNext/>
       <w:keepLines/>
-      <w:jc w:val="center"/>
-    </w:pPr>
-  </w:style>
-  <w:style w:styleId="Date" w:type="paragraph">
-    <w:name w:val="Date"/>
-    <w:next w:val="BodyText"/>
+      <w:spacing w:after="0" w:before="200"/>
+      <w:outlineLvl w:val="2"/>
+    </w:pPr>
+    <w:rPr>
+      <w:rFonts w:asciiTheme="majorHAnsi" w:cstheme="majorBidi" w:eastAsiaTheme="majorEastAsia" w:hAnsiTheme="majorHAnsi"/>
+      <w:b/>
+      <w:bCs/>
+      <w:color w:themeColor="accent1" w:val="4F81BD"/>
+      <w:sz w:val="24"/>
+      <w:szCs w:val="24"/>
+    </w:rPr>
+  </w:style>
+  <w:style w:styleId="Heading4" w:type="paragraph">
+    <w:name w:val="Heading 4"/>
+    <w:basedOn w:val="Normal"/>
+    <w:next w:val="BodyText"/>
+    <w:uiPriority w:val="9"/>
+    <w:unhideWhenUsed/>
     <w:qFormat/>
     <w:pPr>
       <w:keepNext/>
       <w:keepLines/>
-      <w:jc w:val="center"/>
-    </w:pPr>
-  </w:style>
-  <w:style w:customStyle="1" w:styleId="AbstractTitle" w:type="paragraph">
-    <w:name w:val="Abstract Title"/>
-    <w:basedOn w:val="Normal"/>
-    <w:next w:val="Abstract"/>
+      <w:spacing w:after="0" w:before="200"/>
+      <w:outlineLvl w:val="3"/>
+    </w:pPr>
+    <w:rPr>
+      <w:rFonts w:asciiTheme="majorHAnsi" w:cstheme="majorBidi" w:eastAsiaTheme="majorEastAsia" w:hAnsiTheme="majorHAnsi"/>
+      <w:i/>
+      <w:bCs/>
+      <w:color w:themeColor="accent1" w:val="4F81BD"/>
+      <w:sz w:val="24"/>
+      <w:szCs w:val="24"/>
+    </w:rPr>
+  </w:style>
+  <w:style w:styleId="Heading5" w:type="paragraph">
+    <w:name w:val="Heading 5"/>
+    <w:basedOn w:val="Normal"/>
+    <w:next w:val="BodyText"/>
+    <w:uiPriority w:val="9"/>
+    <w:unhideWhenUsed/>
     <w:qFormat/>
     <w:pPr>
       <w:keepNext/>
       <w:keepLines/>
-      <w:spacing w:after="0" w:before="300"/>
-      <w:jc w:val="center"/>
-    </w:pPr>
-    <w:rPr>
-      <w:b/>
-      <w:color w:val="345A8A"/>
-      <w:sz w:val="20"/>
-      <w:szCs w:val="20"/>
-    </w:rPr>
-  </w:style>
-  <w:style w:customStyle="1" w:styleId="Abstract" w:type="paragraph">
-    <w:name w:val="Abstract"/>
-    <w:basedOn w:val="Normal"/>
-    <w:next w:val="BodyText"/>
+      <w:spacing w:after="0" w:before="200"/>
+      <w:outlineLvl w:val="4"/>
+    </w:pPr>
+    <w:rPr>
+      <w:rFonts w:asciiTheme="majorHAnsi" w:cstheme="majorBidi" w:eastAsiaTheme="majorEastAsia" w:hAnsiTheme="majorHAnsi"/>
+      <w:iCs/>
+      <w:color w:themeColor="accent1" w:val="4F81BD"/>
+      <w:sz w:val="24"/>
+      <w:szCs w:val="24"/>
+    </w:rPr>
+  </w:style>
+  <w:style w:styleId="Heading6" w:type="paragraph">
+    <w:name w:val="Heading 6"/>
+    <w:basedOn w:val="Normal"/>
+    <w:next w:val="BodyText"/>
+    <w:uiPriority w:val="9"/>
+    <w:unhideWhenUsed/>
     <w:qFormat/>
     <w:pPr>
       <w:keepNext/>
       <w:keepLines/>
-      <w:spacing w:after="300" w:before="100"/>
-    </w:pPr>
-    <w:rPr>
-      <w:sz w:val="20"/>
-      <w:szCs w:val="20"/>
-    </w:rPr>
-  </w:style>
-  <w:style w:styleId="Bibliography" w:type="paragraph">
-    <w:name w:val="Bibliography"/>
-    <w:basedOn w:val="Normal"/>
-    <w:next w:val="Bibliography"/>
-    <w:qFormat/>
-    <w:pPr/>
-    <w:rPr/>
-  </w:style>
-  <w:style w:styleId="Heading1" w:type="paragraph">
-    <w:name w:val="heading 1"/>
-    <w:basedOn w:val="Normal"/>
-    <w:next w:val="BodyText"/>
-    <w:link w:val="Heading1Char"/>
+      <w:spacing w:after="0" w:before="200"/>
+      <w:outlineLvl w:val="5"/>
+    </w:pPr>
+    <w:rPr>
+      <w:rFonts w:asciiTheme="majorHAnsi" w:cstheme="majorBidi" w:eastAsiaTheme="majorEastAsia" w:hAnsiTheme="majorHAnsi"/>
+      <w:color w:themeColor="accent1" w:val="4F81BD"/>
+      <w:sz w:val="24"/>
+      <w:szCs w:val="24"/>
+    </w:rPr>
+  </w:style>
+  <w:style w:styleId="Heading7" w:type="paragraph">
+    <w:name w:val="Heading 7"/>
+    <w:basedOn w:val="Normal"/>
+    <w:next w:val="BodyText"/>
     <w:uiPriority w:val="9"/>
-    <w:qFormat/>
-    <w:rsid w:val="00A10FD9"/>
+    <w:unhideWhenUsed/>
+    <w:qFormat/>
     <w:pPr>
       <w:keepNext/>
       <w:keepLines/>
-      <w:spacing w:after="80" w:before="360"/>
-      <w:outlineLvl w:val="0"/>
+      <w:spacing w:after="0" w:before="200"/>
+      <w:outlineLvl w:val="6"/>
     </w:pPr>
     <w:rPr>
       <w:rFonts w:asciiTheme="majorHAnsi" w:cstheme="majorBidi" w:eastAsiaTheme="majorEastAsia" w:hAnsiTheme="majorHAnsi"/>
-      <w:color w:themeColor="accent1" w:themeShade="BF" w:val="0F4761"/>
-      <w:sz w:val="40"/>
-      <w:szCs w:val="40"/>
-    </w:rPr>
-  </w:style>
-  <w:style w:styleId="Heading2" w:type="paragraph">
-    <w:name w:val="heading 2"/>
-    <w:basedOn w:val="Normal"/>
-    <w:next w:val="BodyText"/>
-    <w:link w:val="Heading2Char"/>
+      <w:color w:themeColor="accent1" w:val="4F81BD"/>
+      <w:sz w:val="24"/>
+      <w:szCs w:val="24"/>
+    </w:rPr>
+  </w:style>
+  <w:style w:styleId="Heading8" w:type="paragraph">
+    <w:name w:val="Heading 8"/>
+    <w:basedOn w:val="Normal"/>
+    <w:next w:val="BodyText"/>
     <w:uiPriority w:val="9"/>
-    <w:semiHidden/>
     <w:unhideWhenUsed/>
     <w:qFormat/>
-    <w:rsid w:val="00A10FD9"/>
     <w:pPr>
       <w:keepNext/>
       <w:keepLines/>
-      <w:spacing w:after="80" w:before="160"/>
-      <w:outlineLvl w:val="1"/>
+      <w:spacing w:after="0" w:before="200"/>
+      <w:outlineLvl w:val="7"/>
     </w:pPr>
     <w:rPr>
       <w:rFonts w:asciiTheme="majorHAnsi" w:cstheme="majorBidi" w:eastAsiaTheme="majorEastAsia" w:hAnsiTheme="majorHAnsi"/>
-      <w:color w:themeColor="accent1" w:themeShade="BF" w:val="0F4761"/>
-      <w:sz w:val="32"/>
-      <w:szCs w:val="32"/>
-    </w:rPr>
-  </w:style>
-  <w:style w:styleId="Heading3" w:type="paragraph">
-    <w:name w:val="heading 3"/>
-    <w:basedOn w:val="Normal"/>
-    <w:next w:val="BodyText"/>
-    <w:link w:val="Heading3Char"/>
+      <w:color w:themeColor="accent1" w:val="4F81BD"/>
+      <w:sz w:val="24"/>
+      <w:szCs w:val="24"/>
+    </w:rPr>
+  </w:style>
+  <w:style w:styleId="Heading9" w:type="paragraph">
+    <w:name w:val="Heading 9"/>
+    <w:basedOn w:val="Normal"/>
+    <w:next w:val="BodyText"/>
     <w:uiPriority w:val="9"/>
-    <w:semiHidden/>
     <w:unhideWhenUsed/>
     <w:qFormat/>
-    <w:rsid w:val="00A10FD9"/>
     <w:pPr>
       <w:keepNext/>
       <w:keepLines/>
-      <w:spacing w:after="80" w:before="160"/>
-      <w:outlineLvl w:val="2"/>
-    </w:pPr>
-    <w:rPr>
-      <w:rFonts w:cstheme="majorBidi" w:eastAsiaTheme="majorEastAsia"/>
-      <w:color w:themeColor="accent1" w:themeShade="BF" w:val="0F4761"/>
-      <w:sz w:val="28"/>
-      <w:szCs w:val="28"/>
-    </w:rPr>
-  </w:style>
-  <w:style w:styleId="Heading4" w:type="paragraph">
-    <w:name w:val="heading 4"/>
-    <w:basedOn w:val="Normal"/>
-    <w:next w:val="BodyText"/>
-    <w:link w:val="Heading4Char"/>
-    <w:uiPriority w:val="9"/>
-    <w:semiHidden/>
-    <w:unhideWhenUsed/>
-    <w:qFormat/>
-    <w:rsid w:val="00A10FD9"/>
-    <w:pPr>
-      <w:keepNext/>
-      <w:keepLines/>
-      <w:spacing w:after="40" w:before="80"/>
-      <w:outlineLvl w:val="3"/>
-    </w:pPr>
-    <w:rPr>
-      <w:rFonts w:cstheme="majorBidi" w:eastAsiaTheme="majorEastAsia"/>
-      <w:i/>
-      <w:iCs/>
-      <w:color w:themeColor="accent1" w:themeShade="BF" w:val="0F4761"/>
-    </w:rPr>
-  </w:style>
-  <w:style w:styleId="Heading5" w:type="paragraph">
-    <w:name w:val="heading 5"/>
-    <w:basedOn w:val="Normal"/>
-    <w:next w:val="BodyText"/>
-    <w:link w:val="Heading5Char"/>
-    <w:uiPriority w:val="9"/>
-    <w:semiHidden/>
-    <w:unhideWhenUsed/>
-    <w:qFormat/>
-    <w:rsid w:val="00A10FD9"/>
-    <w:pPr>
-      <w:keepNext/>
-      <w:keepLines/>
-      <w:spacing w:after="40" w:before="80"/>
-      <w:outlineLvl w:val="4"/>
-    </w:pPr>
-    <w:rPr>
-      <w:rFonts w:cstheme="majorBidi" w:eastAsiaTheme="majorEastAsia"/>
-      <w:color w:themeColor="accent1" w:themeShade="BF" w:val="0F4761"/>
-    </w:rPr>
-  </w:style>
-  <w:style w:styleId="Heading6" w:type="paragraph">
-    <w:name w:val="heading 6"/>
-    <w:basedOn w:val="Normal"/>
-    <w:next w:val="BodyText"/>
-    <w:link w:val="Heading6Char"/>
-    <w:uiPriority w:val="9"/>
-    <w:semiHidden/>
-    <w:unhideWhenUsed/>
-    <w:qFormat/>
-    <w:rsid w:val="00A10FD9"/>
-    <w:pPr>
-      <w:keepNext/>
-      <w:keepLines/>
-      <w:spacing w:after="0" w:before="40"/>
-      <w:outlineLvl w:val="5"/>
-    </w:pPr>
-    <w:rPr>
-      <w:rFonts w:cstheme="majorBidi" w:eastAsiaTheme="majorEastAsia"/>
-      <w:i/>
-      <w:iCs/>
-      <w:color w:themeColor="text1" w:themeTint="A6" w:val="595959"/>
-    </w:rPr>
-  </w:style>
-  <w:style w:styleId="Heading7" w:type="paragraph">
-    <w:name w:val="heading 7"/>
-    <w:basedOn w:val="Normal"/>
-    <w:next w:val="BodyText"/>
-    <w:link w:val="Heading7Char"/>
-    <w:uiPriority w:val="9"/>
-    <w:semiHidden/>
-    <w:unhideWhenUsed/>
-    <w:qFormat/>
-    <w:rsid w:val="00A10FD9"/>
-    <w:pPr>
-      <w:keepNext/>
-      <w:keepLines/>
-      <w:spacing w:after="0" w:before="40"/>
-      <w:outlineLvl w:val="6"/>
-    </w:pPr>
-    <w:rPr>
-      <w:rFonts w:cstheme="majorBidi" w:eastAsiaTheme="majorEastAsia"/>
-      <w:color w:themeColor="text1" w:themeTint="A6" w:val="595959"/>
-    </w:rPr>
-  </w:style>
-  <w:style w:styleId="Heading8" w:type="paragraph">
-    <w:name w:val="heading 8"/>
-    <w:basedOn w:val="Normal"/>
-    <w:next w:val="BodyText"/>
-    <w:link w:val="Heading8Char"/>
-    <w:uiPriority w:val="9"/>
-    <w:semiHidden/>
-    <w:unhideWhenUsed/>
-    <w:qFormat/>
-    <w:rsid w:val="00A10FD9"/>
-    <w:pPr>
-      <w:keepNext/>
-      <w:keepLines/>
-      <w:spacing w:after="0"/>
-      <w:outlineLvl w:val="7"/>
-    </w:pPr>
-    <w:rPr>
-      <w:rFonts w:cstheme="majorBidi" w:eastAsiaTheme="majorEastAsia"/>
-      <w:i/>
-      <w:iCs/>
-      <w:color w:themeColor="text1" w:themeTint="D8" w:val="272727"/>
-    </w:rPr>
-  </w:style>
-  <w:style w:styleId="Heading9" w:type="paragraph">
-    <w:name w:val="heading 9"/>
-    <w:basedOn w:val="Normal"/>
-    <w:next w:val="BodyText"/>
-    <w:link w:val="Heading9Char"/>
-    <w:uiPriority w:val="9"/>
-    <w:semiHidden/>
-    <w:unhideWhenUsed/>
-    <w:qFormat/>
-    <w:rsid w:val="00A10FD9"/>
-    <w:pPr>
-      <w:keepNext/>
-      <w:keepLines/>
-      <w:spacing w:after="0"/>
+      <w:spacing w:after="0" w:before="200"/>
       <w:outlineLvl w:val="8"/>
     </w:pPr>
     <w:rPr>
-      <w:rFonts w:cstheme="majorBidi" w:eastAsiaTheme="majorEastAsia"/>
-      <w:color w:themeColor="text1" w:themeTint="D8" w:val="272727"/>
-    </w:rPr>
-  </w:style>
-  <w:style w:customStyle="1" w:styleId="Heading1Char" w:type="character">
-    <w:name w:val="Heading 1 Char"/>
-    <w:basedOn w:val="DefaultParagraphFont"/>
-    <w:link w:val="Heading1"/>
-    <w:uiPriority w:val="9"/>
-    <w:rsid w:val="00A10FD9"/>
-    <w:rPr>
       <w:rFonts w:asciiTheme="majorHAnsi" w:cstheme="majorBidi" w:eastAsiaTheme="majorEastAsia" w:hAnsiTheme="majorHAnsi"/>
-      <w:color w:themeColor="accent1" w:themeShade="BF" w:val="0F4761"/>
-      <w:sz w:val="40"/>
-      <w:szCs w:val="40"/>
-    </w:rPr>
-  </w:style>
-  <w:style w:customStyle="1" w:styleId="Heading2Char" w:type="character">
-    <w:name w:val="Heading 2 Char"/>
-    <w:basedOn w:val="DefaultParagraphFont"/>
-    <w:link w:val="Heading2"/>
-    <w:uiPriority w:val="9"/>
-    <w:semiHidden/>
-    <w:rsid w:val="00A10FD9"/>
-    <w:rPr>
-      <w:rFonts w:asciiTheme="majorHAnsi" w:cstheme="majorBidi" w:eastAsiaTheme="majorEastAsia" w:hAnsiTheme="majorHAnsi"/>
-      <w:color w:themeColor="accent1" w:themeShade="BF" w:val="0F4761"/>
-      <w:sz w:val="32"/>
-      <w:szCs w:val="32"/>
-    </w:rPr>
-  </w:style>
-  <w:style w:customStyle="1" w:styleId="Heading3Char" w:type="character">
-    <w:name w:val="Heading 3 Char"/>
-    <w:basedOn w:val="DefaultParagraphFont"/>
-    <w:link w:val="Heading3"/>
-    <w:uiPriority w:val="9"/>
-    <w:semiHidden/>
-    <w:rsid w:val="00A10FD9"/>
-    <w:rPr>
-      <w:rFonts w:cstheme="majorBidi" w:eastAsiaTheme="majorEastAsia"/>
-      <w:color w:themeColor="accent1" w:themeShade="BF" w:val="0F4761"/>
-      <w:sz w:val="28"/>
-      <w:szCs w:val="28"/>
-    </w:rPr>
-  </w:style>
-  <w:style w:customStyle="1" w:styleId="Heading4Char" w:type="character">
-    <w:name w:val="Heading 4 Char"/>
-    <w:basedOn w:val="DefaultParagraphFont"/>
-    <w:link w:val="Heading4"/>
-    <w:uiPriority w:val="9"/>
-    <w:semiHidden/>
-    <w:rsid w:val="00A10FD9"/>
-    <w:rPr>
-      <w:rFonts w:cstheme="majorBidi" w:eastAsiaTheme="majorEastAsia"/>
-      <w:i/>
-      <w:iCs/>
-      <w:color w:themeColor="accent1" w:themeShade="BF" w:val="0F4761"/>
-    </w:rPr>
-  </w:style>
-  <w:style w:customStyle="1" w:styleId="Heading5Char" w:type="character">
-    <w:name w:val="Heading 5 Char"/>
-    <w:basedOn w:val="DefaultParagraphFont"/>
-    <w:link w:val="Heading5"/>
-    <w:uiPriority w:val="9"/>
-    <w:semiHidden/>
-    <w:rsid w:val="00A10FD9"/>
-    <w:rPr>
-      <w:rFonts w:cstheme="majorBidi" w:eastAsiaTheme="majorEastAsia"/>
-      <w:color w:themeColor="accent1" w:themeShade="BF" w:val="0F4761"/>
-    </w:rPr>
-  </w:style>
-  <w:style w:customStyle="1" w:styleId="Heading6Char" w:type="character">
-    <w:name w:val="Heading 6 Char"/>
-    <w:basedOn w:val="DefaultParagraphFont"/>
-    <w:link w:val="Heading6"/>
-    <w:uiPriority w:val="9"/>
-    <w:semiHidden/>
-    <w:rsid w:val="00A10FD9"/>
-    <w:rPr>
-      <w:rFonts w:cstheme="majorBidi" w:eastAsiaTheme="majorEastAsia"/>
-      <w:i/>
-      <w:iCs/>
-      <w:color w:themeColor="text1" w:themeTint="A6" w:val="595959"/>
-    </w:rPr>
-  </w:style>
-  <w:style w:customStyle="1" w:styleId="Heading7Char" w:type="character">
-    <w:name w:val="Heading 7 Char"/>
-    <w:basedOn w:val="DefaultParagraphFont"/>
-    <w:link w:val="Heading7"/>
-    <w:uiPriority w:val="9"/>
-    <w:semiHidden/>
-    <w:rsid w:val="00A10FD9"/>
-    <w:rPr>
-      <w:rFonts w:cstheme="majorBidi" w:eastAsiaTheme="majorEastAsia"/>
-      <w:color w:themeColor="text1" w:themeTint="A6" w:val="595959"/>
-    </w:rPr>
-  </w:style>
-  <w:style w:customStyle="1" w:styleId="Heading8Char" w:type="character">
-    <w:name w:val="Heading 8 Char"/>
-    <w:basedOn w:val="DefaultParagraphFont"/>
-    <w:link w:val="Heading8"/>
-    <w:uiPriority w:val="9"/>
-    <w:semiHidden/>
-    <w:rsid w:val="00A10FD9"/>
-    <w:rPr>
-      <w:rFonts w:cstheme="majorBidi" w:eastAsiaTheme="majorEastAsia"/>
-      <w:i/>
-      <w:iCs/>
-      <w:color w:themeColor="text1" w:themeTint="D8" w:val="272727"/>
-    </w:rPr>
-  </w:style>
-  <w:style w:customStyle="1" w:styleId="Heading9Char" w:type="character">
-    <w:name w:val="Heading 9 Char"/>
-    <w:basedOn w:val="DefaultParagraphFont"/>
-    <w:link w:val="Heading9"/>
-    <w:uiPriority w:val="9"/>
-    <w:semiHidden/>
-    <w:rsid w:val="00A10FD9"/>
-    <w:rPr>
-      <w:rFonts w:cstheme="majorBidi" w:eastAsiaTheme="majorEastAsia"/>
-      <w:color w:themeColor="text1" w:themeTint="D8" w:val="272727"/>
+      <w:color w:themeColor="accent1" w:val="4F81BD"/>
+      <w:sz w:val="24"/>
+      <w:szCs w:val="24"/>
     </w:rPr>
   </w:style>
   <w:style w:styleId="BlockText" w:type="paragraph">
@@ -979,18 +796,6 @@
     <w:uiPriority w:val="9"/>
     <w:unhideWhenUsed/>
     <w:qFormat/>
-  </w:style>
-  <w:style w:styleId="FootnoteBlockText" w:type="paragraph">
-    <w:name w:val="Footnote Block Text"/>
-    <w:basedOn w:val="FootnoteText"/>
-    <w:next w:val="FootnoteText"/>
-    <w:uiPriority w:val="9"/>
-    <w:unhideWhenUsed/>
-    <w:qFormat/>
-    <w:pPr>
-      <w:spacing w:after="100" w:before="100"/>
-      <w:ind w:firstLine="0" w:left="480" w:right="480"/>
-    </w:pPr>
   </w:style>
   <w:style w:default="1" w:styleId="DefaultParagraphFont" w:type="character">
     <w:name w:val="Default Paragraph Font"/>
@@ -1021,10 +826,10 @@
         <w:jc w:val="left"/>
       </w:trPr>
       <w:tcPr>
+        <w:vAlign w:val="bottom"/>
         <w:tcBorders>
           <w:bottom w:val="single"/>
         </w:tcBorders>
-        <w:vAlign w:val="bottom"/>
       </w:tcPr>
     </w:tblStylePr>
   </w:style>
@@ -1139,8 +944,8 @@
     <w:name w:val="KeywordTok"/>
     <w:basedOn w:val="VerbatimChar"/>
     <w:rPr>
+      <w:color w:val="007020"/>
       <w:b/>
-      <w:color w:val="007020"/>
     </w:rPr>
   </w:style>
   <w:style w:type="character" w:customStyle="1" w:styleId="DataTypeTok">
@@ -1217,42 +1022,42 @@
     <w:name w:val="ImportTok"/>
     <w:basedOn w:val="VerbatimChar"/>
     <w:rPr>
+      <w:color w:val="008000"/>
       <w:b/>
-      <w:color w:val="008000"/>
     </w:rPr>
   </w:style>
   <w:style w:type="character" w:customStyle="1" w:styleId="CommentTok">
     <w:name w:val="CommentTok"/>
     <w:basedOn w:val="VerbatimChar"/>
     <w:rPr>
+      <w:color w:val="60a0b0"/>
       <w:i/>
-      <w:color w:val="60a0b0"/>
     </w:rPr>
   </w:style>
   <w:style w:type="character" w:customStyle="1" w:styleId="DocumentationTok">
     <w:name w:val="DocumentationTok"/>
     <w:basedOn w:val="VerbatimChar"/>
     <w:rPr>
+      <w:color w:val="ba2121"/>
       <w:i/>
-      <w:color w:val="ba2121"/>
     </w:rPr>
   </w:style>
   <w:style w:type="character" w:customStyle="1" w:styleId="AnnotationTok">
     <w:name w:val="AnnotationTok"/>
     <w:basedOn w:val="VerbatimChar"/>
     <w:rPr>
+      <w:color w:val="60a0b0"/>
       <w:b/>
       <w:i/>
-      <w:color w:val="60a0b0"/>
     </w:rPr>
   </w:style>
   <w:style w:type="character" w:customStyle="1" w:styleId="CommentVarTok">
     <w:name w:val="CommentVarTok"/>
     <w:basedOn w:val="VerbatimChar"/>
     <w:rPr>
+      <w:color w:val="60a0b0"/>
       <w:b/>
       <w:i/>
-      <w:color w:val="60a0b0"/>
     </w:rPr>
   </w:style>
   <w:style w:type="character" w:customStyle="1" w:styleId="OtherTok">
@@ -1280,8 +1085,8 @@
     <w:name w:val="ControlFlowTok"/>
     <w:basedOn w:val="VerbatimChar"/>
     <w:rPr>
+      <w:color w:val="007020"/>
       <w:b/>
-      <w:color w:val="007020"/>
     </w:rPr>
   </w:style>
   <w:style w:type="character" w:customStyle="1" w:styleId="OperatorTok">
@@ -1326,34 +1131,34 @@
     <w:name w:val="InformationTok"/>
     <w:basedOn w:val="VerbatimChar"/>
     <w:rPr>
+      <w:color w:val="60a0b0"/>
       <w:b/>
       <w:i/>
-      <w:color w:val="60a0b0"/>
     </w:rPr>
   </w:style>
   <w:style w:type="character" w:customStyle="1" w:styleId="WarningTok">
     <w:name w:val="WarningTok"/>
     <w:basedOn w:val="VerbatimChar"/>
     <w:rPr>
+      <w:color w:val="60a0b0"/>
       <w:b/>
       <w:i/>
-      <w:color w:val="60a0b0"/>
     </w:rPr>
   </w:style>
   <w:style w:type="character" w:customStyle="1" w:styleId="AlertTok">
     <w:name w:val="AlertTok"/>
     <w:basedOn w:val="VerbatimChar"/>
     <w:rPr>
+      <w:color w:val="ff0000"/>
       <w:b/>
-      <w:color w:val="ff0000"/>
     </w:rPr>
   </w:style>
   <w:style w:type="character" w:customStyle="1" w:styleId="ErrorTok">
     <w:name w:val="ErrorTok"/>
     <w:basedOn w:val="VerbatimChar"/>
     <w:rPr>
+      <w:color w:val="ff0000"/>
       <w:b/>
-      <w:color w:val="ff0000"/>
     </w:rPr>
   </w:style>
   <w:style w:type="character" w:customStyle="1" w:styleId="NormalTok">
@@ -1375,44 +1180,44 @@
         <a:sysClr val="window" lastClr="FFFFFF"/>
       </a:lt1>
       <a:dk2>
-        <a:srgbClr val="0E2841"/>
+        <a:srgbClr val="1F497D"/>
       </a:dk2>
       <a:lt2>
-        <a:srgbClr val="E8E8E8"/>
+        <a:srgbClr val="EEECE1"/>
       </a:lt2>
       <a:accent1>
-        <a:srgbClr val="156082"/>
+        <a:srgbClr val="4F81BD"/>
       </a:accent1>
       <a:accent2>
-        <a:srgbClr val="E97132"/>
+        <a:srgbClr val="C0504D"/>
       </a:accent2>
       <a:accent3>
-        <a:srgbClr val="196B24"/>
+        <a:srgbClr val="9BBB59"/>
       </a:accent3>
       <a:accent4>
-        <a:srgbClr val="0F9ED5"/>
+        <a:srgbClr val="8064A2"/>
       </a:accent4>
       <a:accent5>
-        <a:srgbClr val="A02B93"/>
+        <a:srgbClr val="4BACC6"/>
       </a:accent5>
       <a:accent6>
-        <a:srgbClr val="4EA72E"/>
+        <a:srgbClr val="F79646"/>
       </a:accent6>
       <a:hlink>
-        <a:srgbClr val="467886"/>
+        <a:srgbClr val="0000FF"/>
       </a:hlink>
       <a:folHlink>
-        <a:srgbClr val="96607D"/>
+        <a:srgbClr val="800080"/>
       </a:folHlink>
     </a:clrScheme>
     <a:fontScheme name="Office">
       <a:majorFont>
-        <a:latin typeface="Aptos Display" panose="02110004020202020204"/>
+        <a:latin typeface="Calibri"/>
         <a:ea typeface=""/>
         <a:cs typeface=""/>
-        <a:font script="Jpan" typeface="游ゴシック Light"/>
+        <a:font script="Jpan" typeface="ＭＳ ゴシック"/>
         <a:font script="Hang" typeface="맑은 고딕"/>
-        <a:font script="Hans" typeface="等线 Light"/>
+        <a:font script="Hans" typeface="宋体"/>
         <a:font script="Hant" typeface="新細明體"/>
         <a:font script="Arab" typeface="Times New Roman"/>
         <a:font script="Hebr" typeface="Times New Roman"/>
@@ -1439,32 +1244,14 @@
         <a:font script="Mong" typeface="Mongolian Baiti"/>
         <a:font script="Viet" typeface="Times New Roman"/>
         <a:font script="Uigh" typeface="Microsoft Uighur"/>
-        <a:font script="Geor" typeface="Sylfaen"/>
-        <a:font script="Armn" typeface="Arial"/>
-        <a:font script="Bugi" typeface="Leelawadee UI"/>
-        <a:font script="Bopo" typeface="Microsoft JhengHei"/>
-        <a:font script="Java" typeface="Javanese Text"/>
-        <a:font script="Lisu" typeface="Segoe UI"/>
-        <a:font script="Mymr" typeface="Myanmar Text"/>
-        <a:font script="Nkoo" typeface="Ebrima"/>
-        <a:font script="Olck" typeface="Nirmala UI"/>
-        <a:font script="Osma" typeface="Ebrima"/>
-        <a:font script="Phag" typeface="Phagspa"/>
-        <a:font script="Syrn" typeface="Estrangelo Edessa"/>
-        <a:font script="Syrj" typeface="Estrangelo Edessa"/>
-        <a:font script="Syre" typeface="Estrangelo Edessa"/>
-        <a:font script="Sora" typeface="Nirmala UI"/>
-        <a:font script="Tale" typeface="Microsoft Tai Le"/>
-        <a:font script="Talu" typeface="Microsoft New Tai Lue"/>
-        <a:font script="Tfng" typeface="Ebrima"/>
       </a:majorFont>
       <a:minorFont>
-        <a:latin typeface="Aptos" panose="02110004020202020204"/>
+        <a:latin typeface="Cambria"/>
         <a:ea typeface=""/>
         <a:cs typeface=""/>
-        <a:font script="Jpan" typeface="游明朝"/>
+        <a:font script="Jpan" typeface="ＭＳ 明朝"/>
         <a:font script="Hang" typeface="맑은 고딕"/>
-        <a:font script="Hans" typeface="等线"/>
+        <a:font script="Hans" typeface="宋体"/>
         <a:font script="Hant" typeface="新細明體"/>
         <a:font script="Arab" typeface="Arial"/>
         <a:font script="Hebr" typeface="Arial"/>
@@ -1491,24 +1278,6 @@
         <a:font script="Mong" typeface="Mongolian Baiti"/>
         <a:font script="Viet" typeface="Arial"/>
         <a:font script="Uigh" typeface="Microsoft Uighur"/>
-        <a:font script="Geor" typeface="Sylfaen"/>
-        <a:font script="Armn" typeface="Arial"/>
-        <a:font script="Bugi" typeface="Leelawadee UI"/>
-        <a:font script="Bopo" typeface="Microsoft JhengHei"/>
-        <a:font script="Java" typeface="Javanese Text"/>
-        <a:font script="Lisu" typeface="Segoe UI"/>
-        <a:font script="Mymr" typeface="Myanmar Text"/>
-        <a:font script="Nkoo" typeface="Ebrima"/>
-        <a:font script="Olck" typeface="Nirmala UI"/>
-        <a:font script="Osma" typeface="Ebrima"/>
-        <a:font script="Phag" typeface="Phagspa"/>
-        <a:font script="Syrn" typeface="Estrangelo Edessa"/>
-        <a:font script="Syrj" typeface="Estrangelo Edessa"/>
-        <a:font script="Syre" typeface="Estrangelo Edessa"/>
-        <a:font script="Sora" typeface="Nirmala UI"/>
-        <a:font script="Tale" typeface="Microsoft Tai Le"/>
-        <a:font script="Talu" typeface="Microsoft New Tai Lue"/>
-        <a:font script="Tfng" typeface="Ebrima"/>
       </a:minorFont>
     </a:fontScheme>
     <a:fmtScheme name="Office">
@@ -1520,141 +1289,200 @@
           <a:gsLst>
             <a:gs pos="0">
               <a:schemeClr val="phClr">
-                <a:lumMod val="110000"/>
-                <a:satMod val="105000"/>
-                <a:tint val="67000"/>
+                <a:tint val="50000"/>
+                <a:satMod val="300000"/>
               </a:schemeClr>
             </a:gs>
-            <a:gs pos="50000">
+            <a:gs pos="35000">
               <a:schemeClr val="phClr">
-                <a:lumMod val="105000"/>
-                <a:satMod val="103000"/>
-                <a:tint val="73000"/>
+                <a:tint val="37000"/>
+                <a:satMod val="300000"/>
               </a:schemeClr>
             </a:gs>
             <a:gs pos="100000">
               <a:schemeClr val="phClr">
-                <a:lumMod val="105000"/>
-                <a:satMod val="109000"/>
-                <a:tint val="81000"/>
+                <a:tint val="15000"/>
+                <a:satMod val="350000"/>
               </a:schemeClr>
             </a:gs>
           </a:gsLst>
-          <a:lin ang="5400000" scaled="0"/>
+          <a:lin ang="16200000" scaled="1"/>
         </a:gradFill>
         <a:gradFill rotWithShape="1">
           <a:gsLst>
             <a:gs pos="0">
               <a:schemeClr val="phClr">
-                <a:satMod val="103000"/>
-                <a:lumMod val="102000"/>
-                <a:tint val="94000"/>
-              </a:schemeClr>
-            </a:gs>
-            <a:gs pos="50000">
-              <a:schemeClr val="phClr">
-                <a:satMod val="110000"/>
-                <a:lumMod val="100000"/>
+                <a:tint val="100000"/>
                 <a:shade val="100000"/>
+                <a:satMod val="130000"/>
               </a:schemeClr>
             </a:gs>
             <a:gs pos="100000">
               <a:schemeClr val="phClr">
-                <a:lumMod val="99000"/>
-                <a:satMod val="120000"/>
-                <a:shade val="78000"/>
+                <a:tint val="50000"/>
+                <a:shade val="100000"/>
+                <a:satMod val="350000"/>
               </a:schemeClr>
             </a:gs>
           </a:gsLst>
-          <a:lin ang="5400000" scaled="0"/>
+          <a:lin ang="16200000" scaled="0"/>
         </a:gradFill>
       </a:fillStyleLst>
       <a:lnStyleLst>
-        <a:ln w="6350" cap="flat" cmpd="sng" algn="ctr">
+        <a:ln w="9525" cap="flat" cmpd="sng" algn="ctr">
+          <a:solidFill>
+            <a:schemeClr val="phClr">
+              <a:shade val="95000"/>
+              <a:satMod val="105000"/>
+            </a:schemeClr>
+          </a:solidFill>
+          <a:prstDash val="solid"/>
+        </a:ln>
+        <a:ln w="25400" cap="flat" cmpd="sng" algn="ctr">
           <a:solidFill>
             <a:schemeClr val="phClr"/>
           </a:solidFill>
           <a:prstDash val="solid"/>
-          <a:miter lim="800000"/>
         </a:ln>
-        <a:ln w="12700" cap="flat" cmpd="sng" algn="ctr">
+        <a:ln w="38100" cap="flat" cmpd="sng" algn="ctr">
           <a:solidFill>
             <a:schemeClr val="phClr"/>
           </a:solidFill>
           <a:prstDash val="solid"/>
-          <a:miter lim="800000"/>
-        </a:ln>
-        <a:ln w="19050" cap="flat" cmpd="sng" algn="ctr">
-          <a:solidFill>
-            <a:schemeClr val="phClr"/>
-          </a:solidFill>
-          <a:prstDash val="solid"/>
-          <a:miter lim="800000"/>
         </a:ln>
       </a:lnStyleLst>
       <a:effectStyleLst>
         <a:effectStyle>
-          <a:effectLst/>
-        </a:effectStyle>
-        <a:effectStyle>
-          <a:effectLst/>
+          <a:effectLst>
+            <a:outerShdw blurRad="40000" dist="20000" dir="5400000" rotWithShape="0">
+              <a:srgbClr val="000000">
+                <a:alpha val="38000"/>
+              </a:srgbClr>
+            </a:outerShdw>
+          </a:effectLst>
         </a:effectStyle>
         <a:effectStyle>
           <a:effectLst>
-            <a:outerShdw blurRad="57150" dist="19050" dir="5400000" algn="ctr" rotWithShape="0">
+            <a:outerShdw blurRad="40000" dist="23000" dir="5400000" rotWithShape="0">
               <a:srgbClr val="000000">
-                <a:alpha val="63000"/>
+                <a:alpha val="35000"/>
               </a:srgbClr>
             </a:outerShdw>
           </a:effectLst>
+        </a:effectStyle>
+        <a:effectStyle>
+          <a:effectLst>
+            <a:outerShdw blurRad="40000" dist="23000" dir="5400000" rotWithShape="0">
+              <a:srgbClr val="000000">
+                <a:alpha val="35000"/>
+              </a:srgbClr>
+            </a:outerShdw>
+          </a:effectLst>
+          <a:scene3d>
+            <a:camera prst="orthographicFront">
+              <a:rot lat="0" lon="0" rev="0"/>
+            </a:camera>
+            <a:lightRig rig="threePt" dir="t">
+              <a:rot lat="0" lon="0" rev="1200000"/>
+            </a:lightRig>
+          </a:scene3d>
+          <a:sp3d>
+            <a:bevelT w="63500" h="25400"/>
+          </a:sp3d>
         </a:effectStyle>
       </a:effectStyleLst>
       <a:bgFillStyleLst>
         <a:solidFill>
           <a:schemeClr val="phClr"/>
         </a:solidFill>
-        <a:solidFill>
-          <a:schemeClr val="phClr">
-            <a:tint val="95000"/>
-            <a:satMod val="170000"/>
-          </a:schemeClr>
-        </a:solidFill>
         <a:gradFill rotWithShape="1">
           <a:gsLst>
             <a:gs pos="0">
               <a:schemeClr val="phClr">
-                <a:tint val="93000"/>
-                <a:satMod val="150000"/>
-                <a:shade val="98000"/>
-                <a:lumMod val="102000"/>
+                <a:tint val="40000"/>
+                <a:satMod val="350000"/>
               </a:schemeClr>
             </a:gs>
-            <a:gs pos="50000">
+            <a:gs pos="40000">
               <a:schemeClr val="phClr">
-                <a:tint val="98000"/>
-                <a:satMod val="130000"/>
-                <a:shade val="90000"/>
-                <a:lumMod val="103000"/>
+                <a:tint val="45000"/>
+                <a:shade val="99000"/>
+                <a:satMod val="350000"/>
               </a:schemeClr>
             </a:gs>
             <a:gs pos="100000">
               <a:schemeClr val="phClr">
-                <a:shade val="63000"/>
-                <a:satMod val="120000"/>
+                <a:shade val="20000"/>
+                <a:satMod val="255000"/>
               </a:schemeClr>
             </a:gs>
           </a:gsLst>
-          <a:lin ang="5400000" scaled="0"/>
+          <a:path path="circle">
+            <a:fillToRect l="50000" t="-80000" r="50000" b="180000"/>
+          </a:path>
+        </a:gradFill>
+        <a:gradFill rotWithShape="1">
+          <a:gsLst>
+            <a:gs pos="0">
+              <a:schemeClr val="phClr">
+                <a:tint val="80000"/>
+                <a:satMod val="300000"/>
+              </a:schemeClr>
+            </a:gs>
+            <a:gs pos="100000">
+              <a:schemeClr val="phClr">
+                <a:shade val="30000"/>
+                <a:satMod val="200000"/>
+              </a:schemeClr>
+            </a:gs>
+          </a:gsLst>
+          <a:path path="circle">
+            <a:fillToRect l="50000" t="50000" r="50000" b="50000"/>
+          </a:path>
         </a:gradFill>
       </a:bgFillStyleLst>
     </a:fmtScheme>
   </a:themeElements>
-  <a:objectDefaults/>
+  <a:objectDefaults>
+    <a:spDef>
+      <a:spPr/>
+      <a:bodyPr/>
+      <a:lstStyle/>
+      <a:style>
+        <a:lnRef idx="1">
+          <a:schemeClr val="accent1"/>
+        </a:lnRef>
+        <a:fillRef idx="3">
+          <a:schemeClr val="accent1"/>
+        </a:fillRef>
+        <a:effectRef idx="2">
+          <a:schemeClr val="accent1"/>
+        </a:effectRef>
+        <a:fontRef idx="minor">
+          <a:schemeClr val="lt1"/>
+        </a:fontRef>
+      </a:style>
+    </a:spDef>
+    <a:lnDef>
+      <a:spPr/>
+      <a:bodyPr/>
+      <a:lstStyle/>
+      <a:style>
+        <a:lnRef idx="2">
+          <a:schemeClr val="accent1"/>
+        </a:lnRef>
+        <a:fillRef idx="0">
+          <a:schemeClr val="accent1"/>
+        </a:fillRef>
+        <a:effectRef idx="1">
+          <a:schemeClr val="accent1"/>
+        </a:effectRef>
+        <a:fontRef idx="minor">
+          <a:schemeClr val="tx1"/>
+        </a:fontRef>
+      </a:style>
+    </a:lnDef>
+  </a:objectDefaults>
   <a:extraClrSchemeLst/>
-  <a:extLst>
-    <a:ext uri="{05A4C25C-085E-4340-85A3-A5531E510DB2}">
-      <thm15:themeFamily xmlns:thm15="http://schemas.microsoft.com/office/thememl/2012/main" name="Office Theme" id="{2E142A2C-CD16-42D6-873A-C26D2A0506FA}" vid="{1BDDFF52-6CD6-40A5-AB3C-68EB2F1E4D0A}"/>
-    </a:ext>
-  </a:extLst>
 </a:theme>
 </file>
</xml_diff>